<commit_message>
fix: Synchronize all templates in webapp with original root templates
</commit_message>
<xml_diff>
--- a/webapp/templates/TOTRINH/06_Mau_Quyet_dinh_ban_hanh_quy_che_quy_dinh.docx
+++ b/webapp/templates/TOTRINH/06_Mau_Quyet_dinh_ban_hanh_quy_che_quy_dinh.docx
@@ -1,155 +1,10 @@
 
 <file path=word/document.xml><?xml version="1.0" encoding="utf-8"?>
-<w:document xmlns:wpc="http://schemas.microsoft.com/office/word/2010/wordprocessingCanvas" xmlns:cx="http://schemas.microsoft.com/office/drawing/2014/chartex" xmlns:cx1="http://schemas.microsoft.com/office/drawing/2015/9/8/chartex" xmlns:cx2="http://schemas.microsoft.com/office/drawing/2015/10/21/chartex" xmlns:cx3="http://schemas.microsoft.com/office/drawing/2016/5/9/chartex" xmlns:cx4="http://schemas.microsoft.com/office/drawing/2016/5/10/chartex" xmlns:cx5="http://schemas.microsoft.com/office/drawing/2016/5/11/chartex" xmlns:cx6="http://schemas.microsoft.com/office/drawing/2016/5/12/chartex" xmlns:cx7="http://schemas.microsoft.com/office/drawing/2016/5/13/chartex" xmlns:cx8="http://schemas.microsoft.com/office/drawing/2016/5/14/chartex" xmlns:mc="http://schemas.openxmlformats.org/markup-compatibility/2006" xmlns:aink="http://schemas.microsoft.com/office/drawing/2016/ink" xmlns:am3d="http://schemas.microsoft.com/office/drawing/2017/model3d" xmlns:o="urn:schemas-microsoft-com:office:office" xmlns:oel="http://schemas.microsoft.com/office/2019/extlst" xmlns:r="http://schemas.openxmlformats.org/officeDocument/2006/relationships" xmlns:m="http://schemas.openxmlformats.org/officeDocument/2006/math" xmlns:v="urn:schemas-microsoft-com:vml" xmlns:wp14="http://schemas.microsoft.com/office/word/2010/wordprocessingDrawing" xmlns:wp="http://schemas.openxmlformats.org/drawingml/2006/wordprocessingDrawing" xmlns:w10="urn:schemas-microsoft-com:office:word" xmlns:w="http://schemas.openxmlformats.org/wordprocessingml/2006/main" xmlns:w14="http://schemas.microsoft.com/office/word/2010/wordml" xmlns:w15="http://schemas.microsoft.com/office/word/2012/wordml" xmlns:w16cex="http://schemas.microsoft.com/office/word/2018/wordml/cex" xmlns:w16cid="http://schemas.microsoft.com/office/word/2016/wordml/cid" xmlns:w16="http://schemas.microsoft.com/office/word/2018/wordml" xmlns:w16du="http://schemas.microsoft.com/office/word/2023/wordml/word16du" xmlns:w16sdtdh="http://schemas.microsoft.com/office/word/2020/wordml/sdtdatahash" xmlns:w16sdtfl="http://schemas.microsoft.com/office/word/2024/wordml/sdtformatlock" xmlns:w16se="http://schemas.microsoft.com/office/word/2015/wordml/symex" xmlns:wpg="http://schemas.microsoft.com/office/word/2010/wordprocessingGroup" xmlns:wpi="http://schemas.microsoft.com/office/word/2010/wordprocessingInk" xmlns:wne="http://schemas.microsoft.com/office/word/2006/wordml" xmlns:wps="http://schemas.microsoft.com/office/word/2010/wordprocessingShape" mc:Ignorable="w14 w15 w16se w16cid w16 w16cex w16sdtdh w16sdtfl w16du wp14">
+<w:document xmlns:wpc="http://schemas.microsoft.com/office/word/2010/wordprocessingCanvas" xmlns:cx="http://schemas.microsoft.com/office/drawing/2014/chartex" xmlns:cx1="http://schemas.microsoft.com/office/drawing/2015/9/8/chartex" xmlns:cx2="http://schemas.microsoft.com/office/drawing/2015/10/21/chartex" xmlns:cx3="http://schemas.microsoft.com/office/drawing/2016/5/9/chartex" xmlns:cx4="http://schemas.microsoft.com/office/drawing/2016/5/10/chartex" xmlns:cx5="http://schemas.microsoft.com/office/drawing/2016/5/11/chartex" xmlns:cx6="http://schemas.microsoft.com/office/drawing/2016/5/12/chartex" xmlns:cx7="http://schemas.microsoft.com/office/drawing/2016/5/13/chartex" xmlns:cx8="http://schemas.microsoft.com/office/drawing/2016/5/14/chartex" xmlns:mc="http://schemas.openxmlformats.org/markup-compatibility/2006" xmlns:aink="http://schemas.microsoft.com/office/drawing/2016/ink" xmlns:am3d="http://schemas.microsoft.com/office/drawing/2017/model3d" xmlns:o="urn:schemas-microsoft-com:office:office" xmlns:oel="http://schemas.microsoft.com/office/2019/extlst" xmlns:r="http://schemas.openxmlformats.org/officeDocument/2006/relationships" xmlns:m="http://schemas.openxmlformats.org/officeDocument/2006/math" xmlns:v="urn:schemas-microsoft-com:vml" xmlns:wp14="http://schemas.microsoft.com/office/word/2010/wordprocessingDrawing" xmlns:wp="http://schemas.openxmlformats.org/drawingml/2006/wordprocessingDrawing" xmlns:w10="urn:schemas-microsoft-com:office:word" xmlns:w="http://schemas.openxmlformats.org/wordprocessingml/2006/main" xmlns:w14="http://schemas.microsoft.com/office/word/2010/wordml" xmlns:w15="http://schemas.microsoft.com/office/word/2012/wordml" xmlns:w16cei="http://schemas.microsoft.com/office/word/2026/wordml/cei" xmlns:w16cex="http://schemas.microsoft.com/office/word/2018/wordml/cex" xmlns:w16cid="http://schemas.microsoft.com/office/word/2016/wordml/cid" xmlns:w16="http://schemas.microsoft.com/office/word/2018/wordml" xmlns:w16du="http://schemas.microsoft.com/office/word/2023/wordml/word16du" xmlns:w16sdtdh="http://schemas.microsoft.com/office/word/2020/wordml/sdtdatahash" xmlns:w16sdtfl="http://schemas.microsoft.com/office/word/2024/wordml/sdtformatlock" xmlns:w16se="http://schemas.microsoft.com/office/word/2015/wordml/symex" xmlns:wpg="http://schemas.microsoft.com/office/word/2010/wordprocessingGroup" xmlns:wpi="http://schemas.microsoft.com/office/word/2010/wordprocessingInk" xmlns:wne="http://schemas.microsoft.com/office/word/2006/wordml" xmlns:wps="http://schemas.microsoft.com/office/word/2010/wordprocessingShape" mc:Ignorable="w14 w15 w16se w16cid w16 w16cex w16sdtdh w16sdtfl w16du wp14">
   <w:body>
     <w:tbl>
       <w:tblPr>
-        <w:tblW w:w="9525" w:type="dxa"/>
-        <w:tblInd w:w="-113" w:type="dxa"/>
-        <w:tblBorders>
-          <w:top w:val="single" w:sz="8" w:space="0" w:color="auto"/>
-        </w:tblBorders>
-        <w:tblLayout w:type="fixed"/>
-        <w:tblLook w:val="0000" w:firstRow="0" w:lastRow="0" w:firstColumn="0" w:lastColumn="0" w:noHBand="0" w:noVBand="0"/>
-      </w:tblPr>
-      <w:tblGrid>
-        <w:gridCol w:w="113"/>
-        <w:gridCol w:w="9322"/>
-        <w:gridCol w:w="90"/>
-      </w:tblGrid>
-      <w:tr>
-        <w:tblPrEx>
-          <w:tblBorders>
-            <w:top w:val="none" w:sz="0" w:space="0" w:color="auto"/>
-            <w:bottom w:val="single" w:sz="8" w:space="0" w:color="auto"/>
-          </w:tblBorders>
-        </w:tblPrEx>
-        <w:trPr>
-          <w:gridAfter w:val="1"/>
-          <w:wAfter w:w="90" w:type="dxa"/>
-          <w:cantSplit/>
-        </w:trPr>
-        <w:tc>
-          <w:tcPr>
-            <w:tcW w:w="9435" w:type="dxa"/>
-            <w:gridSpan w:val="2"/>
-            <w:tcBorders>
-              <w:top w:val="nil"/>
-              <w:left w:val="nil"/>
-              <w:bottom w:val="single" w:sz="8" w:space="0" w:color="auto"/>
-              <w:right w:val="nil"/>
-            </w:tcBorders>
-          </w:tcPr>
-          <w:p>
-            <w:pPr>
-              <w:pStyle w:val="BodyTextIndent"/>
-              <w:spacing w:after="0"/>
-              <w:ind w:firstLine="0"/>
-              <w:rPr>
-                <w:rFonts w:ascii="Times New Roman" w:hAnsi="Times New Roman"/>
-                <w:b/>
-              </w:rPr>
-            </w:pPr>
-            <w:r>
-              <w:rPr>
-                <w:rFonts w:ascii="Times New Roman" w:hAnsi="Times New Roman"/>
-                <w:b/>
-              </w:rPr>
-            </w:r>
-            <w:r>
-              <w:rPr>
-                <w:rFonts w:ascii="Times New Roman" w:hAnsi="Times New Roman"/>
-                <w:b/>
-              </w:rPr>
-            </w:r>
-          </w:p>
-          <w:p>
-            <w:pPr>
-              <w:pStyle w:val="BodyTextIndent"/>
-              <w:spacing w:after="0"/>
-              <w:ind w:firstLine="0"/>
-              <w:rPr>
-                <w:rFonts w:ascii="Times New Roman" w:hAnsi="Times New Roman"/>
-                <w:b/>
-              </w:rPr>
-            </w:pPr>
-            <w:r>
-              <w:rPr>
-                <w:rFonts w:ascii="Times New Roman" w:hAnsi="Times New Roman"/>
-                <w:b/>
-              </w:rPr>
-              <w:t xml:space="preserve">Mẫu </w:t>
-            </w:r>
-            <w:r>
-              <w:rPr>
-                <w:rFonts w:ascii="Times New Roman" w:hAnsi="Times New Roman"/>
-                <w:b/>
-              </w:rPr>
-              <w:t>6</w:t>
-            </w:r>
-            <w:r>
-              <w:rPr>
-                <w:rFonts w:ascii="Times New Roman" w:hAnsi="Times New Roman"/>
-                <w:b/>
-              </w:rPr>
-              <w:t>. Quyết định</w:t>
-            </w:r>
-            <w:r>
-              <w:rPr>
-                <w:rFonts w:ascii="Times New Roman" w:hAnsi="Times New Roman"/>
-                <w:b/>
-              </w:rPr>
-              <w:t xml:space="preserve"> </w:t>
-            </w:r>
-            <w:r>
-              <w:rPr>
-                <w:rFonts w:ascii="Times New Roman" w:hAnsi="Times New Roman"/>
-                <w:b/>
-              </w:rPr>
-              <w:t xml:space="preserve">quy định gián tiếp </w:t>
-            </w:r>
-            <w:r>
-              <w:rPr>
-                <w:rFonts w:ascii="Times New Roman" w:hAnsi="Times New Roman"/>
-                <w:b/>
-              </w:rPr>
-              <w:t>(</w:t>
-            </w:r>
-            <w:r>
-              <w:rPr>
-                <w:rFonts w:ascii="Times New Roman" w:hAnsi="Times New Roman"/>
-                <w:b/>
-              </w:rPr>
-              <w:t xml:space="preserve">kèm theo </w:t>
-            </w:r>
-            <w:r>
-              <w:rPr>
-                <w:rFonts w:ascii="Times New Roman" w:hAnsi="Times New Roman"/>
-                <w:b/>
-              </w:rPr>
-              <w:t>quy định</w:t>
-            </w:r>
-            <w:r>
-              <w:rPr>
-                <w:rFonts w:ascii="Times New Roman" w:hAnsi="Times New Roman"/>
-                <w:b/>
-              </w:rPr>
-              <w:t>, quy trình</w:t>
-            </w:r>
-            <w:r>
-              <w:rPr>
-                <w:rFonts w:ascii="Times New Roman" w:hAnsi="Times New Roman"/>
-                <w:b/>
-              </w:rPr>
-              <w:t>)</w:t>
-            </w:r>
-          </w:p>
-        </w:tc>
-      </w:tr>
-    </w:tbl>
-    <w:tbl>
-      <w:tblPr>
-        <w:tblW w:w="0" w:type="auto"/>
+        <w:tblW w:w="9502" w:type="dxa"/>
         <w:tblInd w:w="-113" w:type="dxa"/>
         <w:tblLayout w:type="fixed"/>
         <w:tblCellMar>
@@ -159,8 +14,8 @@
         <w:tblLook w:val="0000" w:firstRow="0" w:lastRow="0" w:firstColumn="0" w:lastColumn="0" w:noHBand="0" w:noVBand="0"/>
       </w:tblPr>
       <w:tblGrid>
-        <w:gridCol w:w="3742"/>
-        <w:gridCol w:w="5670"/>
+        <w:gridCol w:w="3778"/>
+        <w:gridCol w:w="5724"/>
       </w:tblGrid>
       <w:tr>
         <w:trPr>
@@ -169,24 +24,29 @@
         </w:trPr>
         <w:tc>
           <w:tcPr>
-            <w:tcW w:w="3742" w:type="dxa"/>
+            <w:tcW w:w="3778" w:type="dxa"/>
           </w:tcPr>
           <w:p>
             <w:pPr>
               <w:jc w:val="center"/>
               <w:rPr>
                 <w:rFonts w:ascii="Times New Roman" w:hAnsi="Times New Roman"/>
-                <w:bCs/>
-                <w:sz w:val="26"/>
+                <w:szCs w:val="28"/>
               </w:rPr>
             </w:pPr>
             <w:r>
               <w:rPr>
                 <w:rFonts w:ascii="Times New Roman" w:hAnsi="Times New Roman"/>
-                <w:bCs/>
-                <w:sz w:val="26"/>
-              </w:rPr>
-              <w:t xml:space="preserve">TẬP ĐOÀN </w:t>
+                <w:szCs w:val="28"/>
+              </w:rPr>
+              <w:t xml:space="preserve">VIỄN THÔNG </w:t>
+            </w:r>
+            <w:r>
+              <w:rPr>
+                <w:rFonts w:ascii="Times New Roman" w:hAnsi="Times New Roman"/>
+                <w:szCs w:val="28"/>
+              </w:rPr>
+              <w:t>TÂY NINH</w:t>
             </w:r>
           </w:p>
           <w:p>
@@ -194,7 +54,7 @@
               <w:jc w:val="center"/>
               <w:rPr>
                 <w:rFonts w:ascii="Times New Roman" w:hAnsi="Times New Roman"/>
-                <w:bCs/>
+                <w:b/>
                 <w:sz w:val="24"/>
                 <w:szCs w:val="24"/>
               </w:rPr>
@@ -202,39 +62,11 @@
             <w:r>
               <w:rPr>
                 <w:rFonts w:ascii="Times New Roman" w:hAnsi="Times New Roman"/>
-                <w:bCs/>
-                <w:sz w:val="26"/>
-              </w:rPr>
-              <w:t>BƯU CHÍNH VIỄN THÔNG VIỆT NAM</w:t>
-            </w:r>
-          </w:p>
-          <w:p>
-            <w:pPr>
-              <w:jc w:val="center"/>
-              <w:rPr>
-                <w:rFonts w:ascii="Times New Roman" w:hAnsi="Times New Roman"/>
-                <w:b/>
-                <w:sz w:val="24"/>
-                <w:szCs w:val="24"/>
-              </w:rPr>
-            </w:pPr>
-            <w:r>
-              <w:rPr>
-                <w:rFonts w:ascii="Times New Roman" w:hAnsi="Times New Roman"/>
                 <w:b/>
                 <w:bCs/>
                 <w:szCs w:val="28"/>
               </w:rPr>
-              <w:t xml:space="preserve">VIỄN THÔNG </w:t>
-            </w:r>
-            <w:r>
-              <w:rPr>
-                <w:rFonts w:ascii="Times New Roman" w:hAnsi="Times New Roman"/>
-                <w:b/>
-                <w:bCs/>
-                <w:szCs w:val="28"/>
-              </w:rPr>
-              <w:t>TÂY NINH</w:t>
+              <w:t xml:space="preserve">TRUNG TÂM HẠ TẦNG </w:t>
             </w:r>
             <w:r>
               <w:rPr>
@@ -332,7 +164,7 @@
         </w:tc>
         <w:tc>
           <w:tcPr>
-            <w:tcW w:w="5670" w:type="dxa"/>
+            <w:tcW w:w="5724" w:type="dxa"/>
           </w:tcPr>
           <w:p>
             <w:pPr>
@@ -351,8 +183,8 @@
               </w:rPr>
               <w:t xml:space="preserve">CỘNG HOÀ XÃ HỘI CHỦ NGHĨA VIỆT </w:t>
             </w:r>
-            <w:smartTag w:uri="urn:schemas-microsoft-com:office:smarttags" w:element="place">
-              <w:smartTag w:uri="urn:schemas-microsoft-com:office:smarttags" w:element="country-region">
+            <w:smartTag w:uri="urn:schemas-microsoft-com:office:smarttags" w:element="country-region">
+              <w:smartTag w:uri="urn:schemas-microsoft-com:office:smarttags" w:element="place">
                 <w:r>
                   <w:rPr>
                     <w:rFonts w:ascii="Times New Roman" w:hAnsi="Times New Roman"/>
@@ -373,14 +205,88 @@
                 <w:szCs w:val="28"/>
               </w:rPr>
             </w:pPr>
+            <w:proofErr w:type="spellStart"/>
             <w:r>
               <w:rPr>
                 <w:rFonts w:ascii="Times New Roman" w:hAnsi="Times New Roman"/>
                 <w:b/>
                 <w:szCs w:val="28"/>
               </w:rPr>
-              <w:t>Độc lập - Tự do - Hạnh phúc</w:t>
-            </w:r>
+              <w:t>Độc</w:t>
+            </w:r>
+            <w:proofErr w:type="spellEnd"/>
+            <w:r>
+              <w:rPr>
+                <w:rFonts w:ascii="Times New Roman" w:hAnsi="Times New Roman"/>
+                <w:b/>
+                <w:szCs w:val="28"/>
+              </w:rPr>
+              <w:t xml:space="preserve"> </w:t>
+            </w:r>
+            <w:proofErr w:type="spellStart"/>
+            <w:r>
+              <w:rPr>
+                <w:rFonts w:ascii="Times New Roman" w:hAnsi="Times New Roman"/>
+                <w:b/>
+                <w:szCs w:val="28"/>
+              </w:rPr>
+              <w:t>lập</w:t>
+            </w:r>
+            <w:proofErr w:type="spellEnd"/>
+            <w:r>
+              <w:rPr>
+                <w:rFonts w:ascii="Times New Roman" w:hAnsi="Times New Roman"/>
+                <w:b/>
+                <w:szCs w:val="28"/>
+              </w:rPr>
+              <w:t xml:space="preserve"> - </w:t>
+            </w:r>
+            <w:proofErr w:type="spellStart"/>
+            <w:r>
+              <w:rPr>
+                <w:rFonts w:ascii="Times New Roman" w:hAnsi="Times New Roman"/>
+                <w:b/>
+                <w:szCs w:val="28"/>
+              </w:rPr>
+              <w:t>Tự</w:t>
+            </w:r>
+            <w:proofErr w:type="spellEnd"/>
+            <w:r>
+              <w:rPr>
+                <w:rFonts w:ascii="Times New Roman" w:hAnsi="Times New Roman"/>
+                <w:b/>
+                <w:szCs w:val="28"/>
+              </w:rPr>
+              <w:t xml:space="preserve"> do - </w:t>
+            </w:r>
+            <w:proofErr w:type="spellStart"/>
+            <w:r>
+              <w:rPr>
+                <w:rFonts w:ascii="Times New Roman" w:hAnsi="Times New Roman"/>
+                <w:b/>
+                <w:szCs w:val="28"/>
+              </w:rPr>
+              <w:t>Hạnh</w:t>
+            </w:r>
+            <w:proofErr w:type="spellEnd"/>
+            <w:r>
+              <w:rPr>
+                <w:rFonts w:ascii="Times New Roman" w:hAnsi="Times New Roman"/>
+                <w:b/>
+                <w:szCs w:val="28"/>
+              </w:rPr>
+              <w:t xml:space="preserve"> </w:t>
+            </w:r>
+            <w:proofErr w:type="spellStart"/>
+            <w:r>
+              <w:rPr>
+                <w:rFonts w:ascii="Times New Roman" w:hAnsi="Times New Roman"/>
+                <w:b/>
+                <w:szCs w:val="28"/>
+              </w:rPr>
+              <w:t>phúc</w:t>
+            </w:r>
+            <w:proofErr w:type="spellEnd"/>
           </w:p>
           <w:p>
             <w:pPr>
@@ -473,7 +379,7 @@
         </w:trPr>
         <w:tc>
           <w:tcPr>
-            <w:tcW w:w="3742" w:type="dxa"/>
+            <w:tcW w:w="3778" w:type="dxa"/>
           </w:tcPr>
           <w:p>
             <w:pPr>
@@ -492,18 +398,27 @@
               </w:rPr>
               <w:t xml:space="preserve">     </w:t>
             </w:r>
+            <w:proofErr w:type="spellStart"/>
             <w:r>
               <w:rPr>
                 <w:rFonts w:ascii="Times New Roman" w:hAnsi="Times New Roman"/>
                 <w:szCs w:val="28"/>
               </w:rPr>
-              <w:t xml:space="preserve">Số:          </w:t>
+              <w:t>Số</w:t>
+            </w:r>
+            <w:proofErr w:type="spellEnd"/>
+            <w:r>
+              <w:rPr>
+                <w:rFonts w:ascii="Times New Roman" w:hAnsi="Times New Roman"/>
+                <w:szCs w:val="28"/>
+              </w:rPr>
+              <w:t xml:space="preserve">:          </w:t>
             </w:r>
           </w:p>
         </w:tc>
         <w:tc>
           <w:tcPr>
-            <w:tcW w:w="5670" w:type="dxa"/>
+            <w:tcW w:w="5724" w:type="dxa"/>
           </w:tcPr>
           <w:p>
             <w:pPr>
@@ -531,29 +446,75 @@
               </w:rPr>
               <w:t xml:space="preserve">, </w:t>
             </w:r>
+            <w:proofErr w:type="spellStart"/>
             <w:r>
               <w:rPr>
                 <w:rFonts w:ascii="Times New Roman" w:hAnsi="Times New Roman"/>
                 <w:i/>
                 <w:szCs w:val="28"/>
               </w:rPr>
-              <w:t xml:space="preserve">ngày        tháng    </w:t>
-            </w:r>
+              <w:t>ngày</w:t>
+            </w:r>
+            <w:proofErr w:type="spellEnd"/>
             <w:r>
               <w:rPr>
                 <w:rFonts w:ascii="Times New Roman" w:hAnsi="Times New Roman"/>
                 <w:i/>
                 <w:szCs w:val="28"/>
               </w:rPr>
-              <w:t xml:space="preserve"> </w:t>
-            </w:r>
+              <w:t xml:space="preserve">        </w:t>
+            </w:r>
+            <w:proofErr w:type="spellStart"/>
             <w:r>
               <w:rPr>
                 <w:rFonts w:ascii="Times New Roman" w:hAnsi="Times New Roman"/>
                 <w:i/>
                 <w:szCs w:val="28"/>
               </w:rPr>
-              <w:t xml:space="preserve">  năm  </w:t>
+              <w:t>tháng</w:t>
+            </w:r>
+            <w:proofErr w:type="spellEnd"/>
+            <w:r>
+              <w:rPr>
+                <w:rFonts w:ascii="Times New Roman" w:hAnsi="Times New Roman"/>
+                <w:i/>
+                <w:szCs w:val="28"/>
+              </w:rPr>
+              <w:t xml:space="preserve">    </w:t>
+            </w:r>
+            <w:r>
+              <w:rPr>
+                <w:rFonts w:ascii="Times New Roman" w:hAnsi="Times New Roman"/>
+                <w:i/>
+                <w:szCs w:val="28"/>
+              </w:rPr>
+              <w:t xml:space="preserve"> </w:t>
+            </w:r>
+            <w:r>
+              <w:rPr>
+                <w:rFonts w:ascii="Times New Roman" w:hAnsi="Times New Roman"/>
+                <w:i/>
+                <w:szCs w:val="28"/>
+              </w:rPr>
+              <w:t xml:space="preserve">  </w:t>
+            </w:r>
+            <w:proofErr w:type="spellStart"/>
+            <w:r>
+              <w:rPr>
+                <w:rFonts w:ascii="Times New Roman" w:hAnsi="Times New Roman"/>
+                <w:i/>
+                <w:szCs w:val="28"/>
+              </w:rPr>
+              <w:t>năm</w:t>
+            </w:r>
+            <w:proofErr w:type="spellEnd"/>
+            <w:r>
+              <w:rPr>
+                <w:rFonts w:ascii="Times New Roman" w:hAnsi="Times New Roman"/>
+                <w:i/>
+                <w:szCs w:val="28"/>
+              </w:rPr>
+              <w:t xml:space="preserve">  </w:t>
             </w:r>
           </w:p>
         </w:tc>
@@ -612,7 +573,21 @@
         <w:rPr>
           <w:rFonts w:ascii="Times New Roman" w:hAnsi="Times New Roman"/>
         </w:rPr>
-        <w:t xml:space="preserve">Ban hành ................ </w:t>
+        <w:t xml:space="preserve">Ban </w:t>
+      </w:r>
+      <w:proofErr w:type="spellStart"/>
+      <w:r>
+        <w:rPr>
+          <w:rFonts w:ascii="Times New Roman" w:hAnsi="Times New Roman"/>
+        </w:rPr>
+        <w:t>hành</w:t>
+      </w:r>
+      <w:proofErr w:type="spellEnd"/>
+      <w:r>
+        <w:rPr>
+          <w:rFonts w:ascii="Times New Roman" w:hAnsi="Times New Roman"/>
+        </w:rPr>
+        <w:t xml:space="preserve"> ................ </w:t>
       </w:r>
       <w:r>
         <w:rPr>
@@ -850,14 +825,43 @@
         </w:rPr>
         <w:tab/>
       </w:r>
+      <w:proofErr w:type="spellStart"/>
       <w:r>
         <w:rPr>
           <w:rFonts w:ascii="Times New Roman" w:hAnsi="Times New Roman"/>
           <w:i/>
           <w:iCs/>
         </w:rPr>
-        <w:t>Căn cứ .........................................(</w:t>
-      </w:r>
+        <w:t>Căn</w:t>
+      </w:r>
+      <w:proofErr w:type="spellEnd"/>
+      <w:r>
+        <w:rPr>
+          <w:rFonts w:ascii="Times New Roman" w:hAnsi="Times New Roman"/>
+          <w:i/>
+          <w:iCs/>
+        </w:rPr>
+        <w:t xml:space="preserve"> </w:t>
+      </w:r>
+      <w:proofErr w:type="spellStart"/>
+      <w:r>
+        <w:rPr>
+          <w:rFonts w:ascii="Times New Roman" w:hAnsi="Times New Roman"/>
+          <w:i/>
+          <w:iCs/>
+        </w:rPr>
+        <w:t>cứ</w:t>
+      </w:r>
+      <w:proofErr w:type="spellEnd"/>
+      <w:r>
+        <w:rPr>
+          <w:rFonts w:ascii="Times New Roman" w:hAnsi="Times New Roman"/>
+          <w:i/>
+          <w:iCs/>
+        </w:rPr>
+        <w:t xml:space="preserve"> .........................................(</w:t>
+      </w:r>
+      <w:proofErr w:type="gramStart"/>
       <w:r>
         <w:rPr>
           <w:rFonts w:ascii="Times New Roman" w:hAnsi="Times New Roman"/>
@@ -899,6 +903,7 @@
         </w:rPr>
         <w:t>...............................</w:t>
       </w:r>
+      <w:proofErr w:type="gramEnd"/>
     </w:p>
     <w:p>
       <w:pPr>
@@ -941,7 +946,42 @@
           <w:iCs/>
         </w:rPr>
         <w:tab/>
-        <w:t>Căn cứ .........................................</w:t>
+      </w:r>
+      <w:proofErr w:type="spellStart"/>
+      <w:r>
+        <w:rPr>
+          <w:rFonts w:ascii="Times New Roman" w:hAnsi="Times New Roman"/>
+          <w:i/>
+          <w:iCs/>
+        </w:rPr>
+        <w:t>Căn</w:t>
+      </w:r>
+      <w:proofErr w:type="spellEnd"/>
+      <w:r>
+        <w:rPr>
+          <w:rFonts w:ascii="Times New Roman" w:hAnsi="Times New Roman"/>
+          <w:i/>
+          <w:iCs/>
+        </w:rPr>
+        <w:t xml:space="preserve"> </w:t>
+      </w:r>
+      <w:proofErr w:type="spellStart"/>
+      <w:r>
+        <w:rPr>
+          <w:rFonts w:ascii="Times New Roman" w:hAnsi="Times New Roman"/>
+          <w:i/>
+          <w:iCs/>
+        </w:rPr>
+        <w:t>cứ</w:t>
+      </w:r>
+      <w:proofErr w:type="spellEnd"/>
+      <w:r>
+        <w:rPr>
+          <w:rFonts w:ascii="Times New Roman" w:hAnsi="Times New Roman"/>
+          <w:i/>
+          <w:iCs/>
+        </w:rPr>
+        <w:t xml:space="preserve"> .........................................</w:t>
       </w:r>
       <w:r>
         <w:rPr>
@@ -1033,14 +1073,68 @@
           <w:i/>
           <w:iCs/>
         </w:rPr>
-        <w:t xml:space="preserve"> đề nghị của…………………………</w:t>
-      </w:r>
+        <w:t xml:space="preserve"> </w:t>
+      </w:r>
+      <w:proofErr w:type="spellStart"/>
       <w:r>
         <w:rPr>
           <w:rFonts w:ascii="Times New Roman" w:hAnsi="Times New Roman"/>
           <w:i/>
           <w:iCs/>
         </w:rPr>
+        <w:t>đề</w:t>
+      </w:r>
+      <w:proofErr w:type="spellEnd"/>
+      <w:r>
+        <w:rPr>
+          <w:rFonts w:ascii="Times New Roman" w:hAnsi="Times New Roman"/>
+          <w:i/>
+          <w:iCs/>
+        </w:rPr>
+        <w:t xml:space="preserve"> </w:t>
+      </w:r>
+      <w:proofErr w:type="spellStart"/>
+      <w:r>
+        <w:rPr>
+          <w:rFonts w:ascii="Times New Roman" w:hAnsi="Times New Roman"/>
+          <w:i/>
+          <w:iCs/>
+        </w:rPr>
+        <w:t>nghị</w:t>
+      </w:r>
+      <w:proofErr w:type="spellEnd"/>
+      <w:r>
+        <w:rPr>
+          <w:rFonts w:ascii="Times New Roman" w:hAnsi="Times New Roman"/>
+          <w:i/>
+          <w:iCs/>
+        </w:rPr>
+        <w:t xml:space="preserve"> </w:t>
+      </w:r>
+      <w:proofErr w:type="spellStart"/>
+      <w:r>
+        <w:rPr>
+          <w:rFonts w:ascii="Times New Roman" w:hAnsi="Times New Roman"/>
+          <w:i/>
+          <w:iCs/>
+        </w:rPr>
+        <w:t>của</w:t>
+      </w:r>
+      <w:proofErr w:type="spellEnd"/>
+      <w:r>
+        <w:rPr>
+          <w:rFonts w:ascii="Times New Roman" w:hAnsi="Times New Roman"/>
+          <w:i/>
+          <w:iCs/>
+        </w:rPr>
+        <w:t>…………………………</w:t>
+      </w:r>
+      <w:r>
+        <w:rPr>
+          <w:rFonts w:ascii="Times New Roman" w:hAnsi="Times New Roman"/>
+          <w:i/>
+          <w:iCs/>
+        </w:rPr>
         <w:t>,</w:t>
       </w:r>
     </w:p>
@@ -1116,30 +1210,145 @@
         </w:rPr>
         <w:tab/>
       </w:r>
+      <w:proofErr w:type="spellStart"/>
       <w:r>
         <w:rPr>
           <w:rFonts w:ascii="Times New Roman" w:hAnsi="Times New Roman"/>
           <w:b/>
         </w:rPr>
-        <w:t>Điều 1.</w:t>
-      </w:r>
-      <w:r>
-        <w:rPr>
-          <w:rFonts w:ascii="Times New Roman" w:hAnsi="Times New Roman"/>
-        </w:rPr>
-        <w:t xml:space="preserve"> Ban hành</w:t>
-      </w:r>
-      <w:r>
-        <w:rPr>
-          <w:rFonts w:ascii="Times New Roman" w:hAnsi="Times New Roman"/>
-        </w:rPr>
-        <w:t xml:space="preserve"> (phê duyệt)</w:t>
-      </w:r>
-      <w:r>
-        <w:rPr>
-          <w:rFonts w:ascii="Times New Roman" w:hAnsi="Times New Roman"/>
-        </w:rPr>
-        <w:t xml:space="preserve"> kèm theo Quyết định này.......</w:t>
+        <w:t>Điều</w:t>
+      </w:r>
+      <w:proofErr w:type="spellEnd"/>
+      <w:r>
+        <w:rPr>
+          <w:rFonts w:ascii="Times New Roman" w:hAnsi="Times New Roman"/>
+          <w:b/>
+        </w:rPr>
+        <w:t xml:space="preserve"> 1.</w:t>
+      </w:r>
+      <w:r>
+        <w:rPr>
+          <w:rFonts w:ascii="Times New Roman" w:hAnsi="Times New Roman"/>
+        </w:rPr>
+        <w:t xml:space="preserve"> Ban </w:t>
+      </w:r>
+      <w:proofErr w:type="spellStart"/>
+      <w:r>
+        <w:rPr>
+          <w:rFonts w:ascii="Times New Roman" w:hAnsi="Times New Roman"/>
+        </w:rPr>
+        <w:t>hành</w:t>
+      </w:r>
+      <w:proofErr w:type="spellEnd"/>
+      <w:r>
+        <w:rPr>
+          <w:rFonts w:ascii="Times New Roman" w:hAnsi="Times New Roman"/>
+        </w:rPr>
+        <w:t xml:space="preserve"> (</w:t>
+      </w:r>
+      <w:proofErr w:type="spellStart"/>
+      <w:r>
+        <w:rPr>
+          <w:rFonts w:ascii="Times New Roman" w:hAnsi="Times New Roman"/>
+        </w:rPr>
+        <w:t>phê</w:t>
+      </w:r>
+      <w:proofErr w:type="spellEnd"/>
+      <w:r>
+        <w:rPr>
+          <w:rFonts w:ascii="Times New Roman" w:hAnsi="Times New Roman"/>
+        </w:rPr>
+        <w:t xml:space="preserve"> </w:t>
+      </w:r>
+      <w:proofErr w:type="spellStart"/>
+      <w:r>
+        <w:rPr>
+          <w:rFonts w:ascii="Times New Roman" w:hAnsi="Times New Roman"/>
+        </w:rPr>
+        <w:t>duyệt</w:t>
+      </w:r>
+      <w:proofErr w:type="spellEnd"/>
+      <w:r>
+        <w:rPr>
+          <w:rFonts w:ascii="Times New Roman" w:hAnsi="Times New Roman"/>
+        </w:rPr>
+        <w:t>)</w:t>
+      </w:r>
+      <w:r>
+        <w:rPr>
+          <w:rFonts w:ascii="Times New Roman" w:hAnsi="Times New Roman"/>
+        </w:rPr>
+        <w:t xml:space="preserve"> </w:t>
+      </w:r>
+      <w:proofErr w:type="spellStart"/>
+      <w:r>
+        <w:rPr>
+          <w:rFonts w:ascii="Times New Roman" w:hAnsi="Times New Roman"/>
+        </w:rPr>
+        <w:t>kèm</w:t>
+      </w:r>
+      <w:proofErr w:type="spellEnd"/>
+      <w:r>
+        <w:rPr>
+          <w:rFonts w:ascii="Times New Roman" w:hAnsi="Times New Roman"/>
+        </w:rPr>
+        <w:t xml:space="preserve"> </w:t>
+      </w:r>
+      <w:proofErr w:type="spellStart"/>
+      <w:r>
+        <w:rPr>
+          <w:rFonts w:ascii="Times New Roman" w:hAnsi="Times New Roman"/>
+        </w:rPr>
+        <w:t>theo</w:t>
+      </w:r>
+      <w:proofErr w:type="spellEnd"/>
+      <w:r>
+        <w:rPr>
+          <w:rFonts w:ascii="Times New Roman" w:hAnsi="Times New Roman"/>
+        </w:rPr>
+        <w:t xml:space="preserve"> </w:t>
+      </w:r>
+      <w:proofErr w:type="spellStart"/>
+      <w:r>
+        <w:rPr>
+          <w:rFonts w:ascii="Times New Roman" w:hAnsi="Times New Roman"/>
+        </w:rPr>
+        <w:t>Quyết</w:t>
+      </w:r>
+      <w:proofErr w:type="spellEnd"/>
+      <w:r>
+        <w:rPr>
+          <w:rFonts w:ascii="Times New Roman" w:hAnsi="Times New Roman"/>
+        </w:rPr>
+        <w:t xml:space="preserve"> </w:t>
+      </w:r>
+      <w:proofErr w:type="spellStart"/>
+      <w:r>
+        <w:rPr>
+          <w:rFonts w:ascii="Times New Roman" w:hAnsi="Times New Roman"/>
+        </w:rPr>
+        <w:t>định</w:t>
+      </w:r>
+      <w:proofErr w:type="spellEnd"/>
+      <w:r>
+        <w:rPr>
+          <w:rFonts w:ascii="Times New Roman" w:hAnsi="Times New Roman"/>
+        </w:rPr>
+        <w:t xml:space="preserve"> </w:t>
+      </w:r>
+      <w:proofErr w:type="spellStart"/>
+      <w:r>
+        <w:rPr>
+          <w:rFonts w:ascii="Times New Roman" w:hAnsi="Times New Roman"/>
+        </w:rPr>
+        <w:t>này</w:t>
+      </w:r>
+      <w:proofErr w:type="spellEnd"/>
+      <w:r>
+        <w:rPr>
+          <w:rFonts w:ascii="Times New Roman" w:hAnsi="Times New Roman"/>
+        </w:rPr>
+        <w:t>.......</w:t>
       </w:r>
       <w:r>
         <w:rPr>
@@ -1199,12 +1408,21 @@
         </w:rPr>
         <w:tab/>
       </w:r>
+      <w:proofErr w:type="spellStart"/>
       <w:r>
         <w:rPr>
           <w:rFonts w:ascii="Times New Roman" w:hAnsi="Times New Roman"/>
           <w:b/>
         </w:rPr>
-        <w:t xml:space="preserve">Điều 2. </w:t>
+        <w:t>Điều</w:t>
+      </w:r>
+      <w:proofErr w:type="spellEnd"/>
+      <w:r>
+        <w:rPr>
+          <w:rFonts w:ascii="Times New Roman" w:hAnsi="Times New Roman"/>
+          <w:b/>
+        </w:rPr>
+        <w:t xml:space="preserve"> 2. </w:t>
       </w:r>
       <w:r>
         <w:rPr>
@@ -1248,12 +1466,21 @@
         </w:rPr>
         <w:tab/>
       </w:r>
+      <w:proofErr w:type="spellStart"/>
       <w:r>
         <w:rPr>
           <w:rFonts w:ascii="Times New Roman" w:hAnsi="Times New Roman"/>
           <w:b/>
         </w:rPr>
-        <w:t xml:space="preserve">Điều .... </w:t>
+        <w:t>Điều</w:t>
+      </w:r>
+      <w:proofErr w:type="spellEnd"/>
+      <w:r>
+        <w:rPr>
+          <w:rFonts w:ascii="Times New Roman" w:hAnsi="Times New Roman"/>
+          <w:b/>
+        </w:rPr>
+        <w:t xml:space="preserve"> .... </w:t>
       </w:r>
       <w:r>
         <w:rPr>
@@ -1336,6 +1563,7 @@
                 <w:sz w:val="24"/>
               </w:rPr>
             </w:pPr>
+            <w:proofErr w:type="spellStart"/>
             <w:r>
               <w:rPr>
                 <w:rFonts w:ascii="Times New Roman" w:hAnsi="Times New Roman"/>
@@ -1343,7 +1571,37 @@
                 <w:i/>
                 <w:sz w:val="24"/>
               </w:rPr>
-              <w:t>Nơi nhận:</w:t>
+              <w:t>Nơi</w:t>
+            </w:r>
+            <w:proofErr w:type="spellEnd"/>
+            <w:r>
+              <w:rPr>
+                <w:rFonts w:ascii="Times New Roman" w:hAnsi="Times New Roman"/>
+                <w:b/>
+                <w:i/>
+                <w:sz w:val="24"/>
+              </w:rPr>
+              <w:t xml:space="preserve"> </w:t>
+            </w:r>
+            <w:proofErr w:type="spellStart"/>
+            <w:r>
+              <w:rPr>
+                <w:rFonts w:ascii="Times New Roman" w:hAnsi="Times New Roman"/>
+                <w:b/>
+                <w:i/>
+                <w:sz w:val="24"/>
+              </w:rPr>
+              <w:t>nhận</w:t>
+            </w:r>
+            <w:proofErr w:type="spellEnd"/>
+            <w:r>
+              <w:rPr>
+                <w:rFonts w:ascii="Times New Roman" w:hAnsi="Times New Roman"/>
+                <w:b/>
+                <w:i/>
+                <w:sz w:val="24"/>
+              </w:rPr>
+              <w:t>:</w:t>
             </w:r>
           </w:p>
           <w:p>
@@ -1388,13 +1646,29 @@
                 <w:rFonts w:ascii="Times New Roman" w:hAnsi="Times New Roman"/>
                 <w:sz w:val="22"/>
               </w:rPr>
-              <w:t>- Lưu: VT, .....(</w:t>
-            </w:r>
+              <w:t xml:space="preserve">- Lưu: VT, </w:t>
+            </w:r>
+            <w:proofErr w:type="gramStart"/>
             <w:r>
               <w:rPr>
                 <w:rFonts w:ascii="Times New Roman" w:hAnsi="Times New Roman"/>
                 <w:sz w:val="22"/>
               </w:rPr>
+              <w:t>.....</w:t>
+            </w:r>
+            <w:proofErr w:type="gramEnd"/>
+            <w:r>
+              <w:rPr>
+                <w:rFonts w:ascii="Times New Roman" w:hAnsi="Times New Roman"/>
+                <w:sz w:val="22"/>
+              </w:rPr>
+              <w:t>(</w:t>
+            </w:r>
+            <w:r>
+              <w:rPr>
+                <w:rFonts w:ascii="Times New Roman" w:hAnsi="Times New Roman"/>
+                <w:sz w:val="22"/>
+              </w:rPr>
               <w:t>8</w:t>
             </w:r>
             <w:r>
@@ -1411,6 +1685,7 @@
               </w:rPr>
               <w:t>…</w:t>
             </w:r>
+            <w:proofErr w:type="gramStart"/>
             <w:r>
               <w:rPr>
                 <w:rFonts w:ascii="Times New Roman" w:hAnsi="Times New Roman"/>
@@ -1418,6 +1693,7 @@
               </w:rPr>
               <w:t>XX(</w:t>
             </w:r>
+            <w:proofErr w:type="gramEnd"/>
             <w:r>
               <w:rPr>
                 <w:rFonts w:ascii="Times New Roman" w:hAnsi="Times New Roman"/>
@@ -1455,6 +1731,7 @@
                 <w:sz w:val="22"/>
               </w:rPr>
             </w:pPr>
+            <w:proofErr w:type="spellStart"/>
             <w:r>
               <w:rPr>
                 <w:rFonts w:ascii="Times New Roman" w:hAnsi="Times New Roman"/>
@@ -1462,8 +1739,9 @@
                 <w:bCs/>
                 <w:sz w:val="24"/>
               </w:rPr>
-              <w:t>Số eOffice: ..(</w:t>
-            </w:r>
+              <w:t>Số</w:t>
+            </w:r>
+            <w:proofErr w:type="spellEnd"/>
             <w:r>
               <w:rPr>
                 <w:rFonts w:ascii="Times New Roman" w:hAnsi="Times New Roman"/>
@@ -1471,8 +1749,10 @@
                 <w:bCs/>
                 <w:sz w:val="24"/>
               </w:rPr>
-              <w:t>1</w:t>
-            </w:r>
+              <w:t xml:space="preserve"> </w:t>
+            </w:r>
+            <w:proofErr w:type="spellStart"/>
+            <w:proofErr w:type="gramStart"/>
             <w:r>
               <w:rPr>
                 <w:rFonts w:ascii="Times New Roman" w:hAnsi="Times New Roman"/>
@@ -1480,8 +1760,9 @@
                 <w:bCs/>
                 <w:sz w:val="24"/>
               </w:rPr>
-              <w:t>0</w:t>
-            </w:r>
+              <w:t>eOffice</w:t>
+            </w:r>
+            <w:proofErr w:type="spellEnd"/>
             <w:r>
               <w:rPr>
                 <w:rFonts w:ascii="Times New Roman" w:hAnsi="Times New Roman"/>
@@ -1489,7 +1770,55 @@
                 <w:bCs/>
                 <w:sz w:val="24"/>
               </w:rPr>
-              <w:t>)..-</w:t>
+              <w:t>: ..</w:t>
+            </w:r>
+            <w:proofErr w:type="gramEnd"/>
+            <w:r>
+              <w:rPr>
+                <w:rFonts w:ascii="Times New Roman" w:hAnsi="Times New Roman"/>
+                <w:b/>
+                <w:bCs/>
+                <w:sz w:val="24"/>
+              </w:rPr>
+              <w:t>(</w:t>
+            </w:r>
+            <w:r>
+              <w:rPr>
+                <w:rFonts w:ascii="Times New Roman" w:hAnsi="Times New Roman"/>
+                <w:b/>
+                <w:bCs/>
+                <w:sz w:val="24"/>
+              </w:rPr>
+              <w:t>1</w:t>
+            </w:r>
+            <w:r>
+              <w:rPr>
+                <w:rFonts w:ascii="Times New Roman" w:hAnsi="Times New Roman"/>
+                <w:b/>
+                <w:bCs/>
+                <w:sz w:val="24"/>
+              </w:rPr>
+              <w:t>0</w:t>
+            </w:r>
+            <w:proofErr w:type="gramStart"/>
+            <w:r>
+              <w:rPr>
+                <w:rFonts w:ascii="Times New Roman" w:hAnsi="Times New Roman"/>
+                <w:b/>
+                <w:bCs/>
+                <w:sz w:val="24"/>
+              </w:rPr>
+              <w:t>)..</w:t>
+            </w:r>
+            <w:proofErr w:type="gramEnd"/>
+            <w:r>
+              <w:rPr>
+                <w:rFonts w:ascii="Times New Roman" w:hAnsi="Times New Roman"/>
+                <w:b/>
+                <w:bCs/>
+                <w:sz w:val="24"/>
+              </w:rPr>
+              <w:t>-</w:t>
             </w:r>
             <w:r>
               <w:rPr>
@@ -1622,21 +1951,55 @@
                 <w:rFonts w:ascii="Times New Roman" w:hAnsi="Times New Roman"/>
                 <w:i/>
               </w:rPr>
-              <w:t xml:space="preserve">(ký, </w:t>
-            </w:r>
+              <w:t>(</w:t>
+            </w:r>
+            <w:proofErr w:type="spellStart"/>
             <w:r>
               <w:rPr>
                 <w:rFonts w:ascii="Times New Roman" w:hAnsi="Times New Roman"/>
                 <w:i/>
               </w:rPr>
-              <w:t xml:space="preserve">đóng </w:t>
-            </w:r>
+              <w:t>ký</w:t>
+            </w:r>
+            <w:proofErr w:type="spellEnd"/>
             <w:r>
               <w:rPr>
                 <w:rFonts w:ascii="Times New Roman" w:hAnsi="Times New Roman"/>
                 <w:i/>
               </w:rPr>
-              <w:t>dấu)</w:t>
+              <w:t xml:space="preserve">, </w:t>
+            </w:r>
+            <w:proofErr w:type="spellStart"/>
+            <w:r>
+              <w:rPr>
+                <w:rFonts w:ascii="Times New Roman" w:hAnsi="Times New Roman"/>
+                <w:i/>
+              </w:rPr>
+              <w:t>đóng</w:t>
+            </w:r>
+            <w:proofErr w:type="spellEnd"/>
+            <w:r>
+              <w:rPr>
+                <w:rFonts w:ascii="Times New Roman" w:hAnsi="Times New Roman"/>
+                <w:i/>
+              </w:rPr>
+              <w:t xml:space="preserve"> </w:t>
+            </w:r>
+            <w:proofErr w:type="spellStart"/>
+            <w:r>
+              <w:rPr>
+                <w:rFonts w:ascii="Times New Roman" w:hAnsi="Times New Roman"/>
+                <w:i/>
+              </w:rPr>
+              <w:t>dấu</w:t>
+            </w:r>
+            <w:proofErr w:type="spellEnd"/>
+            <w:r>
+              <w:rPr>
+                <w:rFonts w:ascii="Times New Roman" w:hAnsi="Times New Roman"/>
+                <w:i/>
+              </w:rPr>
+              <w:t>)</w:t>
             </w:r>
           </w:p>
           <w:p>
@@ -1668,12 +2031,42 @@
                 <w:rFonts w:ascii="Times New Roman" w:hAnsi="Times New Roman"/>
               </w:rPr>
             </w:pPr>
-            <w:r>
-              <w:rPr>
-                <w:rFonts w:ascii="Times New Roman" w:hAnsi="Times New Roman"/>
-              </w:rPr>
-              <w:t>Họ và tên</w:t>
-            </w:r>
+            <w:proofErr w:type="spellStart"/>
+            <w:r>
+              <w:rPr>
+                <w:rFonts w:ascii="Times New Roman" w:hAnsi="Times New Roman"/>
+              </w:rPr>
+              <w:t>Họ</w:t>
+            </w:r>
+            <w:proofErr w:type="spellEnd"/>
+            <w:r>
+              <w:rPr>
+                <w:rFonts w:ascii="Times New Roman" w:hAnsi="Times New Roman"/>
+              </w:rPr>
+              <w:t xml:space="preserve"> </w:t>
+            </w:r>
+            <w:proofErr w:type="spellStart"/>
+            <w:r>
+              <w:rPr>
+                <w:rFonts w:ascii="Times New Roman" w:hAnsi="Times New Roman"/>
+              </w:rPr>
+              <w:t>và</w:t>
+            </w:r>
+            <w:proofErr w:type="spellEnd"/>
+            <w:r>
+              <w:rPr>
+                <w:rFonts w:ascii="Times New Roman" w:hAnsi="Times New Roman"/>
+              </w:rPr>
+              <w:t xml:space="preserve"> </w:t>
+            </w:r>
+            <w:proofErr w:type="spellStart"/>
+            <w:r>
+              <w:rPr>
+                <w:rFonts w:ascii="Times New Roman" w:hAnsi="Times New Roman"/>
+              </w:rPr>
+              <w:t>tên</w:t>
+            </w:r>
+            <w:proofErr w:type="spellEnd"/>
           </w:p>
         </w:tc>
       </w:tr>
@@ -1683,274 +2076,7 @@
         <w:pStyle w:val="FootnoteText"/>
       </w:pPr>
     </w:p>
-    <w:tbl>
-      <w:tblPr>
-        <w:tblW w:w="9412" w:type="dxa"/>
-        <w:tblBorders>
-          <w:top w:val="single" w:sz="8" w:space="0" w:color="auto"/>
-        </w:tblBorders>
-        <w:tblLayout w:type="fixed"/>
-        <w:tblLook w:val="0000" w:firstRow="0" w:lastRow="0" w:firstColumn="0" w:lastColumn="0" w:noHBand="0" w:noVBand="0"/>
-      </w:tblPr>
-      <w:tblGrid>
-        <w:gridCol w:w="9412"/>
-      </w:tblGrid>
-      <w:tr>
-        <w:tc>
-          <w:tcPr>
-            <w:tcW w:w="9412" w:type="dxa"/>
-            <w:tcBorders>
-              <w:top w:val="single" w:sz="8" w:space="0" w:color="auto"/>
-              <w:left w:val="nil"/>
-              <w:bottom w:val="nil"/>
-              <w:right w:val="nil"/>
-            </w:tcBorders>
-          </w:tcPr>
-          <w:p>
-            <w:pPr>
-              <w:jc w:val="both"/>
-              <w:rPr>
-                <w:rFonts w:ascii="Times New Roman" w:hAnsi="Times New Roman"/>
-                <w:b/>
-                <w:i/>
-                <w:sz w:val="22"/>
-              </w:rPr>
-            </w:pPr>
-            <w:r>
-              <w:rPr>
-                <w:rFonts w:ascii="Times New Roman" w:hAnsi="Times New Roman"/>
-                <w:b/>
-                <w:i/>
-                <w:sz w:val="22"/>
-              </w:rPr>
-              <w:t>Ghi chú:</w:t>
-            </w:r>
-          </w:p>
-          <w:p>
-            <w:pPr>
-              <w:jc w:val="both"/>
-              <w:rPr>
-                <w:rFonts w:ascii="Times New Roman" w:hAnsi="Times New Roman"/>
-                <w:b/>
-                <w:bCs/>
-                <w:i/>
-                <w:iCs/>
-                <w:sz w:val="22"/>
-              </w:rPr>
-            </w:pPr>
-            <w:r>
-              <w:rPr>
-                <w:rFonts w:ascii="Times New Roman" w:hAnsi="Times New Roman"/>
-                <w:b/>
-                <w:bCs/>
-                <w:i/>
-                <w:iCs/>
-                <w:sz w:val="22"/>
-              </w:rPr>
-              <w:t xml:space="preserve">* Mẫu này áp dụng đối với các quyết định ban hành </w:t>
-            </w:r>
-            <w:r>
-              <w:rPr>
-                <w:rFonts w:ascii="Times New Roman" w:hAnsi="Times New Roman"/>
-                <w:b/>
-                <w:bCs/>
-                <w:i/>
-                <w:iCs/>
-                <w:sz w:val="22"/>
-              </w:rPr>
-              <w:t>kèm theo</w:t>
-            </w:r>
-            <w:r>
-              <w:rPr>
-                <w:rFonts w:ascii="Times New Roman" w:hAnsi="Times New Roman"/>
-                <w:b/>
-                <w:bCs/>
-                <w:i/>
-                <w:iCs/>
-                <w:sz w:val="22"/>
-              </w:rPr>
-              <w:t xml:space="preserve"> một văn bản khác như</w:t>
-            </w:r>
-            <w:r>
-              <w:rPr>
-                <w:rFonts w:ascii="Times New Roman" w:hAnsi="Times New Roman"/>
-                <w:b/>
-                <w:bCs/>
-                <w:i/>
-                <w:iCs/>
-                <w:sz w:val="22"/>
-              </w:rPr>
-              <w:t xml:space="preserve">, quy định, </w:t>
-            </w:r>
-            <w:r>
-              <w:rPr>
-                <w:rFonts w:ascii="Times New Roman" w:hAnsi="Times New Roman"/>
-                <w:b/>
-                <w:bCs/>
-                <w:i/>
-                <w:iCs/>
-                <w:sz w:val="22"/>
-              </w:rPr>
-              <w:t xml:space="preserve">quy trình, </w:t>
-            </w:r>
-            <w:r>
-              <w:rPr>
-                <w:rFonts w:ascii="Times New Roman" w:hAnsi="Times New Roman"/>
-                <w:b/>
-                <w:bCs/>
-                <w:i/>
-                <w:iCs/>
-                <w:sz w:val="22"/>
-              </w:rPr>
-              <w:t>chương trình, kế hoạch, đề án, dự án, phương án v.v…</w:t>
-            </w:r>
-          </w:p>
-          <w:p>
-            <w:pPr>
-              <w:jc w:val="both"/>
-              <w:rPr>
-                <w:rFonts w:ascii="Times New Roman" w:hAnsi="Times New Roman"/>
-                <w:i/>
-                <w:iCs/>
-                <w:sz w:val="22"/>
-              </w:rPr>
-            </w:pPr>
-            <w:r>
-              <w:rPr>
-                <w:rFonts w:ascii="Times New Roman" w:hAnsi="Times New Roman"/>
-                <w:b/>
-                <w:bCs/>
-                <w:i/>
-                <w:iCs/>
-                <w:sz w:val="22"/>
-              </w:rPr>
-              <w:t>*</w:t>
-            </w:r>
-            <w:r>
-              <w:rPr>
-                <w:rFonts w:ascii="Times New Roman" w:hAnsi="Times New Roman"/>
-                <w:b/>
-                <w:bCs/>
-                <w:i/>
-                <w:iCs/>
-                <w:sz w:val="22"/>
-              </w:rPr>
-              <w:t xml:space="preserve"> Thể thức và k</w:t>
-            </w:r>
-            <w:r>
-              <w:rPr>
-                <w:rFonts w:ascii="Times New Roman" w:hAnsi="Times New Roman"/>
-                <w:b/>
-                <w:bCs/>
-                <w:i/>
-                <w:iCs/>
-                <w:sz w:val="22"/>
-              </w:rPr>
-              <w:t>ỹ</w:t>
-            </w:r>
-            <w:r>
-              <w:rPr>
-                <w:rFonts w:ascii="Times New Roman" w:hAnsi="Times New Roman"/>
-                <w:b/>
-                <w:bCs/>
-                <w:i/>
-                <w:iCs/>
-                <w:sz w:val="22"/>
-              </w:rPr>
-              <w:t xml:space="preserve"> thuật trình bày như quyết định quy định trực tiếp.</w:t>
-            </w:r>
-          </w:p>
-          <w:p>
-            <w:pPr>
-              <w:jc w:val="both"/>
-              <w:rPr>
-                <w:rFonts w:ascii="Times New Roman" w:hAnsi="Times New Roman"/>
-                <w:sz w:val="22"/>
-              </w:rPr>
-            </w:pPr>
-            <w:r>
-              <w:rPr>
-                <w:rFonts w:ascii="Times New Roman" w:hAnsi="Times New Roman"/>
-                <w:sz w:val="22"/>
-              </w:rPr>
-              <w:t>(</w:t>
-            </w:r>
-            <w:r>
-              <w:rPr>
-                <w:rFonts w:ascii="Times New Roman" w:hAnsi="Times New Roman"/>
-                <w:sz w:val="22"/>
-              </w:rPr>
-              <w:t>3</w:t>
-            </w:r>
-            <w:r>
-              <w:rPr>
-                <w:rFonts w:ascii="Times New Roman" w:hAnsi="Times New Roman"/>
-                <w:sz w:val="22"/>
-              </w:rPr>
-              <w:t xml:space="preserve">) </w:t>
-            </w:r>
-            <w:r>
-              <w:rPr>
-                <w:rFonts w:ascii="Times New Roman" w:hAnsi="Times New Roman"/>
-                <w:sz w:val="22"/>
-              </w:rPr>
-              <w:t>Ghi rõ t</w:t>
-            </w:r>
-            <w:r>
-              <w:rPr>
-                <w:rFonts w:ascii="Times New Roman" w:hAnsi="Times New Roman"/>
-                <w:sz w:val="22"/>
-              </w:rPr>
-              <w:t xml:space="preserve">ên của </w:t>
-            </w:r>
-            <w:r>
-              <w:rPr>
-                <w:rFonts w:ascii="Times New Roman" w:hAnsi="Times New Roman"/>
-                <w:sz w:val="22"/>
-              </w:rPr>
-              <w:t>văn bản</w:t>
-            </w:r>
-            <w:r>
-              <w:rPr>
-                <w:rFonts w:ascii="Times New Roman" w:hAnsi="Times New Roman"/>
-                <w:sz w:val="22"/>
-              </w:rPr>
-              <w:t xml:space="preserve"> được ban hành</w:t>
-            </w:r>
-            <w:r>
-              <w:rPr>
-                <w:rFonts w:ascii="Times New Roman" w:hAnsi="Times New Roman"/>
-                <w:sz w:val="22"/>
-              </w:rPr>
-              <w:t xml:space="preserve"> kèm theo</w:t>
-            </w:r>
-            <w:r>
-              <w:rPr>
-                <w:rFonts w:ascii="Times New Roman" w:hAnsi="Times New Roman"/>
-                <w:sz w:val="22"/>
-              </w:rPr>
-              <w:t>.</w:t>
-            </w:r>
-          </w:p>
-          <w:p>
-            <w:pPr>
-              <w:jc w:val="both"/>
-              <w:rPr>
-                <w:rFonts w:ascii="Times New Roman" w:hAnsi="Times New Roman"/>
-                <w:sz w:val="22"/>
-              </w:rPr>
-            </w:pPr>
-            <w:r>
-              <w:rPr>
-                <w:rFonts w:ascii="Times New Roman" w:hAnsi="Times New Roman"/>
-                <w:sz w:val="22"/>
-              </w:rPr>
-              <w:t>(6) Ghi rõ tên của văn bản được ban hành kèm theo.</w:t>
-            </w:r>
-          </w:p>
-        </w:tc>
-      </w:tr>
-    </w:tbl>
+    <w:p/>
     <w:sectPr>
       <w:headerReference w:type="default" r:id="rId7"/>
       <w:footerReference w:type="even" r:id="rId8"/>
@@ -1966,7 +2092,7 @@
 </file>
 
 <file path=word/endnotes.xml><?xml version="1.0" encoding="utf-8"?>
-<w:endnotes xmlns:wpc="http://schemas.microsoft.com/office/word/2010/wordprocessingCanvas" xmlns:cx="http://schemas.microsoft.com/office/drawing/2014/chartex" xmlns:cx1="http://schemas.microsoft.com/office/drawing/2015/9/8/chartex" xmlns:cx2="http://schemas.microsoft.com/office/drawing/2015/10/21/chartex" xmlns:cx3="http://schemas.microsoft.com/office/drawing/2016/5/9/chartex" xmlns:cx4="http://schemas.microsoft.com/office/drawing/2016/5/10/chartex" xmlns:cx5="http://schemas.microsoft.com/office/drawing/2016/5/11/chartex" xmlns:cx6="http://schemas.microsoft.com/office/drawing/2016/5/12/chartex" xmlns:cx7="http://schemas.microsoft.com/office/drawing/2016/5/13/chartex" xmlns:cx8="http://schemas.microsoft.com/office/drawing/2016/5/14/chartex" xmlns:mc="http://schemas.openxmlformats.org/markup-compatibility/2006" xmlns:aink="http://schemas.microsoft.com/office/drawing/2016/ink" xmlns:am3d="http://schemas.microsoft.com/office/drawing/2017/model3d" xmlns:o="urn:schemas-microsoft-com:office:office" xmlns:oel="http://schemas.microsoft.com/office/2019/extlst" xmlns:r="http://schemas.openxmlformats.org/officeDocument/2006/relationships" xmlns:m="http://schemas.openxmlformats.org/officeDocument/2006/math" xmlns:v="urn:schemas-microsoft-com:vml" xmlns:wp14="http://schemas.microsoft.com/office/word/2010/wordprocessingDrawing" xmlns:wp="http://schemas.openxmlformats.org/drawingml/2006/wordprocessingDrawing" xmlns:w10="urn:schemas-microsoft-com:office:word" xmlns:w="http://schemas.openxmlformats.org/wordprocessingml/2006/main" xmlns:w14="http://schemas.microsoft.com/office/word/2010/wordml" xmlns:w15="http://schemas.microsoft.com/office/word/2012/wordml" xmlns:w16cex="http://schemas.microsoft.com/office/word/2018/wordml/cex" xmlns:w16cid="http://schemas.microsoft.com/office/word/2016/wordml/cid" xmlns:w16="http://schemas.microsoft.com/office/word/2018/wordml" xmlns:w16du="http://schemas.microsoft.com/office/word/2023/wordml/word16du" xmlns:w16sdtdh="http://schemas.microsoft.com/office/word/2020/wordml/sdtdatahash" xmlns:w16sdtfl="http://schemas.microsoft.com/office/word/2024/wordml/sdtformatlock" xmlns:w16se="http://schemas.microsoft.com/office/word/2015/wordml/symex" xmlns:wpg="http://schemas.microsoft.com/office/word/2010/wordprocessingGroup" xmlns:wpi="http://schemas.microsoft.com/office/word/2010/wordprocessingInk" xmlns:wne="http://schemas.microsoft.com/office/word/2006/wordml" xmlns:wps="http://schemas.microsoft.com/office/word/2010/wordprocessingShape" mc:Ignorable="w14 w15 w16se w16cid w16 w16cex w16sdtdh w16sdtfl w16du wp14">
+<w:endnotes xmlns:wpc="http://schemas.microsoft.com/office/word/2010/wordprocessingCanvas" xmlns:cx="http://schemas.microsoft.com/office/drawing/2014/chartex" xmlns:cx1="http://schemas.microsoft.com/office/drawing/2015/9/8/chartex" xmlns:cx2="http://schemas.microsoft.com/office/drawing/2015/10/21/chartex" xmlns:cx3="http://schemas.microsoft.com/office/drawing/2016/5/9/chartex" xmlns:cx4="http://schemas.microsoft.com/office/drawing/2016/5/10/chartex" xmlns:cx5="http://schemas.microsoft.com/office/drawing/2016/5/11/chartex" xmlns:cx6="http://schemas.microsoft.com/office/drawing/2016/5/12/chartex" xmlns:cx7="http://schemas.microsoft.com/office/drawing/2016/5/13/chartex" xmlns:cx8="http://schemas.microsoft.com/office/drawing/2016/5/14/chartex" xmlns:mc="http://schemas.openxmlformats.org/markup-compatibility/2006" xmlns:aink="http://schemas.microsoft.com/office/drawing/2016/ink" xmlns:am3d="http://schemas.microsoft.com/office/drawing/2017/model3d" xmlns:o="urn:schemas-microsoft-com:office:office" xmlns:oel="http://schemas.microsoft.com/office/2019/extlst" xmlns:r="http://schemas.openxmlformats.org/officeDocument/2006/relationships" xmlns:m="http://schemas.openxmlformats.org/officeDocument/2006/math" xmlns:v="urn:schemas-microsoft-com:vml" xmlns:wp14="http://schemas.microsoft.com/office/word/2010/wordprocessingDrawing" xmlns:wp="http://schemas.openxmlformats.org/drawingml/2006/wordprocessingDrawing" xmlns:w10="urn:schemas-microsoft-com:office:word" xmlns:w="http://schemas.openxmlformats.org/wordprocessingml/2006/main" xmlns:w14="http://schemas.microsoft.com/office/word/2010/wordml" xmlns:w15="http://schemas.microsoft.com/office/word/2012/wordml" xmlns:w16cei="http://schemas.microsoft.com/office/word/2026/wordml/cei" xmlns:w16cex="http://schemas.microsoft.com/office/word/2018/wordml/cex" xmlns:w16cid="http://schemas.microsoft.com/office/word/2016/wordml/cid" xmlns:w16="http://schemas.microsoft.com/office/word/2018/wordml" xmlns:w16du="http://schemas.microsoft.com/office/word/2023/wordml/word16du" xmlns:w16sdtdh="http://schemas.microsoft.com/office/word/2020/wordml/sdtdatahash" xmlns:w16sdtfl="http://schemas.microsoft.com/office/word/2024/wordml/sdtformatlock" xmlns:w16se="http://schemas.microsoft.com/office/word/2015/wordml/symex" xmlns:wpg="http://schemas.microsoft.com/office/word/2010/wordprocessingGroup" xmlns:wpi="http://schemas.microsoft.com/office/word/2010/wordprocessingInk" xmlns:wne="http://schemas.microsoft.com/office/word/2006/wordml" xmlns:wps="http://schemas.microsoft.com/office/word/2010/wordprocessingShape" mc:Ignorable="w14 w15 w16se w16cid w16 w16cex w16sdtdh w16sdtfl w16du wp14">
   <w:endnote w:type="separator" w:id="-1">
     <w:p>
       <w:r>
@@ -1985,7 +2111,7 @@
 </file>
 
 <file path=word/footer1.xml><?xml version="1.0" encoding="utf-8"?>
-<w:ftr xmlns:wpc="http://schemas.microsoft.com/office/word/2010/wordprocessingCanvas" xmlns:cx="http://schemas.microsoft.com/office/drawing/2014/chartex" xmlns:cx1="http://schemas.microsoft.com/office/drawing/2015/9/8/chartex" xmlns:cx2="http://schemas.microsoft.com/office/drawing/2015/10/21/chartex" xmlns:cx3="http://schemas.microsoft.com/office/drawing/2016/5/9/chartex" xmlns:cx4="http://schemas.microsoft.com/office/drawing/2016/5/10/chartex" xmlns:cx5="http://schemas.microsoft.com/office/drawing/2016/5/11/chartex" xmlns:cx6="http://schemas.microsoft.com/office/drawing/2016/5/12/chartex" xmlns:cx7="http://schemas.microsoft.com/office/drawing/2016/5/13/chartex" xmlns:cx8="http://schemas.microsoft.com/office/drawing/2016/5/14/chartex" xmlns:mc="http://schemas.openxmlformats.org/markup-compatibility/2006" xmlns:aink="http://schemas.microsoft.com/office/drawing/2016/ink" xmlns:am3d="http://schemas.microsoft.com/office/drawing/2017/model3d" xmlns:o="urn:schemas-microsoft-com:office:office" xmlns:oel="http://schemas.microsoft.com/office/2019/extlst" xmlns:r="http://schemas.openxmlformats.org/officeDocument/2006/relationships" xmlns:m="http://schemas.openxmlformats.org/officeDocument/2006/math" xmlns:v="urn:schemas-microsoft-com:vml" xmlns:wp14="http://schemas.microsoft.com/office/word/2010/wordprocessingDrawing" xmlns:wp="http://schemas.openxmlformats.org/drawingml/2006/wordprocessingDrawing" xmlns:w10="urn:schemas-microsoft-com:office:word" xmlns:w="http://schemas.openxmlformats.org/wordprocessingml/2006/main" xmlns:w14="http://schemas.microsoft.com/office/word/2010/wordml" xmlns:w15="http://schemas.microsoft.com/office/word/2012/wordml" xmlns:w16cex="http://schemas.microsoft.com/office/word/2018/wordml/cex" xmlns:w16cid="http://schemas.microsoft.com/office/word/2016/wordml/cid" xmlns:w16="http://schemas.microsoft.com/office/word/2018/wordml" xmlns:w16du="http://schemas.microsoft.com/office/word/2023/wordml/word16du" xmlns:w16sdtdh="http://schemas.microsoft.com/office/word/2020/wordml/sdtdatahash" xmlns:w16sdtfl="http://schemas.microsoft.com/office/word/2024/wordml/sdtformatlock" xmlns:w16se="http://schemas.microsoft.com/office/word/2015/wordml/symex" xmlns:wpg="http://schemas.microsoft.com/office/word/2010/wordprocessingGroup" xmlns:wpi="http://schemas.microsoft.com/office/word/2010/wordprocessingInk" xmlns:wne="http://schemas.microsoft.com/office/word/2006/wordml" xmlns:wps="http://schemas.microsoft.com/office/word/2010/wordprocessingShape" mc:Ignorable="w14 w15 w16se w16cid w16 w16cex w16sdtdh w16sdtfl w16du wp14">
+<w:ftr xmlns:wpc="http://schemas.microsoft.com/office/word/2010/wordprocessingCanvas" xmlns:cx="http://schemas.microsoft.com/office/drawing/2014/chartex" xmlns:cx1="http://schemas.microsoft.com/office/drawing/2015/9/8/chartex" xmlns:cx2="http://schemas.microsoft.com/office/drawing/2015/10/21/chartex" xmlns:cx3="http://schemas.microsoft.com/office/drawing/2016/5/9/chartex" xmlns:cx4="http://schemas.microsoft.com/office/drawing/2016/5/10/chartex" xmlns:cx5="http://schemas.microsoft.com/office/drawing/2016/5/11/chartex" xmlns:cx6="http://schemas.microsoft.com/office/drawing/2016/5/12/chartex" xmlns:cx7="http://schemas.microsoft.com/office/drawing/2016/5/13/chartex" xmlns:cx8="http://schemas.microsoft.com/office/drawing/2016/5/14/chartex" xmlns:mc="http://schemas.openxmlformats.org/markup-compatibility/2006" xmlns:aink="http://schemas.microsoft.com/office/drawing/2016/ink" xmlns:am3d="http://schemas.microsoft.com/office/drawing/2017/model3d" xmlns:o="urn:schemas-microsoft-com:office:office" xmlns:oel="http://schemas.microsoft.com/office/2019/extlst" xmlns:r="http://schemas.openxmlformats.org/officeDocument/2006/relationships" xmlns:m="http://schemas.openxmlformats.org/officeDocument/2006/math" xmlns:v="urn:schemas-microsoft-com:vml" xmlns:wp14="http://schemas.microsoft.com/office/word/2010/wordprocessingDrawing" xmlns:wp="http://schemas.openxmlformats.org/drawingml/2006/wordprocessingDrawing" xmlns:w10="urn:schemas-microsoft-com:office:word" xmlns:w="http://schemas.openxmlformats.org/wordprocessingml/2006/main" xmlns:w14="http://schemas.microsoft.com/office/word/2010/wordml" xmlns:w15="http://schemas.microsoft.com/office/word/2012/wordml" xmlns:w16cei="http://schemas.microsoft.com/office/word/2026/wordml/cei" xmlns:w16cex="http://schemas.microsoft.com/office/word/2018/wordml/cex" xmlns:w16cid="http://schemas.microsoft.com/office/word/2016/wordml/cid" xmlns:w16="http://schemas.microsoft.com/office/word/2018/wordml" xmlns:w16du="http://schemas.microsoft.com/office/word/2023/wordml/word16du" xmlns:w16sdtdh="http://schemas.microsoft.com/office/word/2020/wordml/sdtdatahash" xmlns:w16sdtfl="http://schemas.microsoft.com/office/word/2024/wordml/sdtformatlock" xmlns:w16se="http://schemas.microsoft.com/office/word/2015/wordml/symex" xmlns:wpg="http://schemas.microsoft.com/office/word/2010/wordprocessingGroup" xmlns:wpi="http://schemas.microsoft.com/office/word/2010/wordprocessingInk" xmlns:wne="http://schemas.microsoft.com/office/word/2006/wordml" xmlns:wps="http://schemas.microsoft.com/office/word/2010/wordprocessingShape" mc:Ignorable="w14 w15 w16se w16cid w16 w16cex w16sdtdh w16sdtfl w16du wp14">
   <w:p>
     <w:pPr>
       <w:pStyle w:val="Footer"/>
@@ -2030,7 +2156,7 @@
 </file>
 
 <file path=word/footer2.xml><?xml version="1.0" encoding="utf-8"?>
-<w:ftr xmlns:wpc="http://schemas.microsoft.com/office/word/2010/wordprocessingCanvas" xmlns:cx="http://schemas.microsoft.com/office/drawing/2014/chartex" xmlns:cx1="http://schemas.microsoft.com/office/drawing/2015/9/8/chartex" xmlns:cx2="http://schemas.microsoft.com/office/drawing/2015/10/21/chartex" xmlns:cx3="http://schemas.microsoft.com/office/drawing/2016/5/9/chartex" xmlns:cx4="http://schemas.microsoft.com/office/drawing/2016/5/10/chartex" xmlns:cx5="http://schemas.microsoft.com/office/drawing/2016/5/11/chartex" xmlns:cx6="http://schemas.microsoft.com/office/drawing/2016/5/12/chartex" xmlns:cx7="http://schemas.microsoft.com/office/drawing/2016/5/13/chartex" xmlns:cx8="http://schemas.microsoft.com/office/drawing/2016/5/14/chartex" xmlns:mc="http://schemas.openxmlformats.org/markup-compatibility/2006" xmlns:aink="http://schemas.microsoft.com/office/drawing/2016/ink" xmlns:am3d="http://schemas.microsoft.com/office/drawing/2017/model3d" xmlns:o="urn:schemas-microsoft-com:office:office" xmlns:oel="http://schemas.microsoft.com/office/2019/extlst" xmlns:r="http://schemas.openxmlformats.org/officeDocument/2006/relationships" xmlns:m="http://schemas.openxmlformats.org/officeDocument/2006/math" xmlns:v="urn:schemas-microsoft-com:vml" xmlns:wp14="http://schemas.microsoft.com/office/word/2010/wordprocessingDrawing" xmlns:wp="http://schemas.openxmlformats.org/drawingml/2006/wordprocessingDrawing" xmlns:w10="urn:schemas-microsoft-com:office:word" xmlns:w="http://schemas.openxmlformats.org/wordprocessingml/2006/main" xmlns:w14="http://schemas.microsoft.com/office/word/2010/wordml" xmlns:w15="http://schemas.microsoft.com/office/word/2012/wordml" xmlns:w16cex="http://schemas.microsoft.com/office/word/2018/wordml/cex" xmlns:w16cid="http://schemas.microsoft.com/office/word/2016/wordml/cid" xmlns:w16="http://schemas.microsoft.com/office/word/2018/wordml" xmlns:w16du="http://schemas.microsoft.com/office/word/2023/wordml/word16du" xmlns:w16sdtdh="http://schemas.microsoft.com/office/word/2020/wordml/sdtdatahash" xmlns:w16sdtfl="http://schemas.microsoft.com/office/word/2024/wordml/sdtformatlock" xmlns:w16se="http://schemas.microsoft.com/office/word/2015/wordml/symex" xmlns:wpg="http://schemas.microsoft.com/office/word/2010/wordprocessingGroup" xmlns:wpi="http://schemas.microsoft.com/office/word/2010/wordprocessingInk" xmlns:wne="http://schemas.microsoft.com/office/word/2006/wordml" xmlns:wps="http://schemas.microsoft.com/office/word/2010/wordprocessingShape" mc:Ignorable="w14 w15 w16se w16cid w16 w16cex w16sdtdh w16sdtfl w16du wp14">
+<w:ftr xmlns:wpc="http://schemas.microsoft.com/office/word/2010/wordprocessingCanvas" xmlns:cx="http://schemas.microsoft.com/office/drawing/2014/chartex" xmlns:cx1="http://schemas.microsoft.com/office/drawing/2015/9/8/chartex" xmlns:cx2="http://schemas.microsoft.com/office/drawing/2015/10/21/chartex" xmlns:cx3="http://schemas.microsoft.com/office/drawing/2016/5/9/chartex" xmlns:cx4="http://schemas.microsoft.com/office/drawing/2016/5/10/chartex" xmlns:cx5="http://schemas.microsoft.com/office/drawing/2016/5/11/chartex" xmlns:cx6="http://schemas.microsoft.com/office/drawing/2016/5/12/chartex" xmlns:cx7="http://schemas.microsoft.com/office/drawing/2016/5/13/chartex" xmlns:cx8="http://schemas.microsoft.com/office/drawing/2016/5/14/chartex" xmlns:mc="http://schemas.openxmlformats.org/markup-compatibility/2006" xmlns:aink="http://schemas.microsoft.com/office/drawing/2016/ink" xmlns:am3d="http://schemas.microsoft.com/office/drawing/2017/model3d" xmlns:o="urn:schemas-microsoft-com:office:office" xmlns:oel="http://schemas.microsoft.com/office/2019/extlst" xmlns:r="http://schemas.openxmlformats.org/officeDocument/2006/relationships" xmlns:m="http://schemas.openxmlformats.org/officeDocument/2006/math" xmlns:v="urn:schemas-microsoft-com:vml" xmlns:wp14="http://schemas.microsoft.com/office/word/2010/wordprocessingDrawing" xmlns:wp="http://schemas.openxmlformats.org/drawingml/2006/wordprocessingDrawing" xmlns:w10="urn:schemas-microsoft-com:office:word" xmlns:w="http://schemas.openxmlformats.org/wordprocessingml/2006/main" xmlns:w14="http://schemas.microsoft.com/office/word/2010/wordml" xmlns:w15="http://schemas.microsoft.com/office/word/2012/wordml" xmlns:w16cei="http://schemas.microsoft.com/office/word/2026/wordml/cei" xmlns:w16cex="http://schemas.microsoft.com/office/word/2018/wordml/cex" xmlns:w16cid="http://schemas.microsoft.com/office/word/2016/wordml/cid" xmlns:w16="http://schemas.microsoft.com/office/word/2018/wordml" xmlns:w16du="http://schemas.microsoft.com/office/word/2023/wordml/word16du" xmlns:w16sdtdh="http://schemas.microsoft.com/office/word/2020/wordml/sdtdatahash" xmlns:w16sdtfl="http://schemas.microsoft.com/office/word/2024/wordml/sdtformatlock" xmlns:w16se="http://schemas.microsoft.com/office/word/2015/wordml/symex" xmlns:wpg="http://schemas.microsoft.com/office/word/2010/wordprocessingGroup" xmlns:wpi="http://schemas.microsoft.com/office/word/2010/wordprocessingInk" xmlns:wne="http://schemas.microsoft.com/office/word/2006/wordml" xmlns:wps="http://schemas.microsoft.com/office/word/2010/wordprocessingShape" mc:Ignorable="w14 w15 w16se w16cid w16 w16cex w16sdtdh w16sdtfl w16du wp14">
   <w:p>
     <w:pPr>
       <w:pStyle w:val="Footer"/>
@@ -2041,7 +2167,7 @@
 </file>
 
 <file path=word/footnotes.xml><?xml version="1.0" encoding="utf-8"?>
-<w:footnotes xmlns:wpc="http://schemas.microsoft.com/office/word/2010/wordprocessingCanvas" xmlns:cx="http://schemas.microsoft.com/office/drawing/2014/chartex" xmlns:cx1="http://schemas.microsoft.com/office/drawing/2015/9/8/chartex" xmlns:cx2="http://schemas.microsoft.com/office/drawing/2015/10/21/chartex" xmlns:cx3="http://schemas.microsoft.com/office/drawing/2016/5/9/chartex" xmlns:cx4="http://schemas.microsoft.com/office/drawing/2016/5/10/chartex" xmlns:cx5="http://schemas.microsoft.com/office/drawing/2016/5/11/chartex" xmlns:cx6="http://schemas.microsoft.com/office/drawing/2016/5/12/chartex" xmlns:cx7="http://schemas.microsoft.com/office/drawing/2016/5/13/chartex" xmlns:cx8="http://schemas.microsoft.com/office/drawing/2016/5/14/chartex" xmlns:mc="http://schemas.openxmlformats.org/markup-compatibility/2006" xmlns:aink="http://schemas.microsoft.com/office/drawing/2016/ink" xmlns:am3d="http://schemas.microsoft.com/office/drawing/2017/model3d" xmlns:o="urn:schemas-microsoft-com:office:office" xmlns:oel="http://schemas.microsoft.com/office/2019/extlst" xmlns:r="http://schemas.openxmlformats.org/officeDocument/2006/relationships" xmlns:m="http://schemas.openxmlformats.org/officeDocument/2006/math" xmlns:v="urn:schemas-microsoft-com:vml" xmlns:wp14="http://schemas.microsoft.com/office/word/2010/wordprocessingDrawing" xmlns:wp="http://schemas.openxmlformats.org/drawingml/2006/wordprocessingDrawing" xmlns:w10="urn:schemas-microsoft-com:office:word" xmlns:w="http://schemas.openxmlformats.org/wordprocessingml/2006/main" xmlns:w14="http://schemas.microsoft.com/office/word/2010/wordml" xmlns:w15="http://schemas.microsoft.com/office/word/2012/wordml" xmlns:w16cex="http://schemas.microsoft.com/office/word/2018/wordml/cex" xmlns:w16cid="http://schemas.microsoft.com/office/word/2016/wordml/cid" xmlns:w16="http://schemas.microsoft.com/office/word/2018/wordml" xmlns:w16du="http://schemas.microsoft.com/office/word/2023/wordml/word16du" xmlns:w16sdtdh="http://schemas.microsoft.com/office/word/2020/wordml/sdtdatahash" xmlns:w16sdtfl="http://schemas.microsoft.com/office/word/2024/wordml/sdtformatlock" xmlns:w16se="http://schemas.microsoft.com/office/word/2015/wordml/symex" xmlns:wpg="http://schemas.microsoft.com/office/word/2010/wordprocessingGroup" xmlns:wpi="http://schemas.microsoft.com/office/word/2010/wordprocessingInk" xmlns:wne="http://schemas.microsoft.com/office/word/2006/wordml" xmlns:wps="http://schemas.microsoft.com/office/word/2010/wordprocessingShape" mc:Ignorable="w14 w15 w16se w16cid w16 w16cex w16sdtdh w16sdtfl w16du wp14">
+<w:footnotes xmlns:wpc="http://schemas.microsoft.com/office/word/2010/wordprocessingCanvas" xmlns:cx="http://schemas.microsoft.com/office/drawing/2014/chartex" xmlns:cx1="http://schemas.microsoft.com/office/drawing/2015/9/8/chartex" xmlns:cx2="http://schemas.microsoft.com/office/drawing/2015/10/21/chartex" xmlns:cx3="http://schemas.microsoft.com/office/drawing/2016/5/9/chartex" xmlns:cx4="http://schemas.microsoft.com/office/drawing/2016/5/10/chartex" xmlns:cx5="http://schemas.microsoft.com/office/drawing/2016/5/11/chartex" xmlns:cx6="http://schemas.microsoft.com/office/drawing/2016/5/12/chartex" xmlns:cx7="http://schemas.microsoft.com/office/drawing/2016/5/13/chartex" xmlns:cx8="http://schemas.microsoft.com/office/drawing/2016/5/14/chartex" xmlns:mc="http://schemas.openxmlformats.org/markup-compatibility/2006" xmlns:aink="http://schemas.microsoft.com/office/drawing/2016/ink" xmlns:am3d="http://schemas.microsoft.com/office/drawing/2017/model3d" xmlns:o="urn:schemas-microsoft-com:office:office" xmlns:oel="http://schemas.microsoft.com/office/2019/extlst" xmlns:r="http://schemas.openxmlformats.org/officeDocument/2006/relationships" xmlns:m="http://schemas.openxmlformats.org/officeDocument/2006/math" xmlns:v="urn:schemas-microsoft-com:vml" xmlns:wp14="http://schemas.microsoft.com/office/word/2010/wordprocessingDrawing" xmlns:wp="http://schemas.openxmlformats.org/drawingml/2006/wordprocessingDrawing" xmlns:w10="urn:schemas-microsoft-com:office:word" xmlns:w="http://schemas.openxmlformats.org/wordprocessingml/2006/main" xmlns:w14="http://schemas.microsoft.com/office/word/2010/wordml" xmlns:w15="http://schemas.microsoft.com/office/word/2012/wordml" xmlns:w16cei="http://schemas.microsoft.com/office/word/2026/wordml/cei" xmlns:w16cex="http://schemas.microsoft.com/office/word/2018/wordml/cex" xmlns:w16cid="http://schemas.microsoft.com/office/word/2016/wordml/cid" xmlns:w16="http://schemas.microsoft.com/office/word/2018/wordml" xmlns:w16du="http://schemas.microsoft.com/office/word/2023/wordml/word16du" xmlns:w16sdtdh="http://schemas.microsoft.com/office/word/2020/wordml/sdtdatahash" xmlns:w16sdtfl="http://schemas.microsoft.com/office/word/2024/wordml/sdtformatlock" xmlns:w16se="http://schemas.microsoft.com/office/word/2015/wordml/symex" xmlns:wpg="http://schemas.microsoft.com/office/word/2010/wordprocessingGroup" xmlns:wpi="http://schemas.microsoft.com/office/word/2010/wordprocessingInk" xmlns:wne="http://schemas.microsoft.com/office/word/2006/wordml" xmlns:wps="http://schemas.microsoft.com/office/word/2010/wordprocessingShape" mc:Ignorable="w14 w15 w16se w16cid w16 w16cex w16sdtdh w16sdtfl w16du wp14">
   <w:footnote w:type="separator" w:id="-1">
     <w:p>
       <w:r>
@@ -2060,7 +2186,7 @@
 </file>
 
 <file path=word/header1.xml><?xml version="1.0" encoding="utf-8"?>
-<w:hdr xmlns:wpc="http://schemas.microsoft.com/office/word/2010/wordprocessingCanvas" xmlns:cx="http://schemas.microsoft.com/office/drawing/2014/chartex" xmlns:cx1="http://schemas.microsoft.com/office/drawing/2015/9/8/chartex" xmlns:cx2="http://schemas.microsoft.com/office/drawing/2015/10/21/chartex" xmlns:cx3="http://schemas.microsoft.com/office/drawing/2016/5/9/chartex" xmlns:cx4="http://schemas.microsoft.com/office/drawing/2016/5/10/chartex" xmlns:cx5="http://schemas.microsoft.com/office/drawing/2016/5/11/chartex" xmlns:cx6="http://schemas.microsoft.com/office/drawing/2016/5/12/chartex" xmlns:cx7="http://schemas.microsoft.com/office/drawing/2016/5/13/chartex" xmlns:cx8="http://schemas.microsoft.com/office/drawing/2016/5/14/chartex" xmlns:mc="http://schemas.openxmlformats.org/markup-compatibility/2006" xmlns:aink="http://schemas.microsoft.com/office/drawing/2016/ink" xmlns:am3d="http://schemas.microsoft.com/office/drawing/2017/model3d" xmlns:o="urn:schemas-microsoft-com:office:office" xmlns:oel="http://schemas.microsoft.com/office/2019/extlst" xmlns:r="http://schemas.openxmlformats.org/officeDocument/2006/relationships" xmlns:m="http://schemas.openxmlformats.org/officeDocument/2006/math" xmlns:v="urn:schemas-microsoft-com:vml" xmlns:wp14="http://schemas.microsoft.com/office/word/2010/wordprocessingDrawing" xmlns:wp="http://schemas.openxmlformats.org/drawingml/2006/wordprocessingDrawing" xmlns:w10="urn:schemas-microsoft-com:office:word" xmlns:w="http://schemas.openxmlformats.org/wordprocessingml/2006/main" xmlns:w14="http://schemas.microsoft.com/office/word/2010/wordml" xmlns:w15="http://schemas.microsoft.com/office/word/2012/wordml" xmlns:w16cex="http://schemas.microsoft.com/office/word/2018/wordml/cex" xmlns:w16cid="http://schemas.microsoft.com/office/word/2016/wordml/cid" xmlns:w16="http://schemas.microsoft.com/office/word/2018/wordml" xmlns:w16du="http://schemas.microsoft.com/office/word/2023/wordml/word16du" xmlns:w16sdtdh="http://schemas.microsoft.com/office/word/2020/wordml/sdtdatahash" xmlns:w16sdtfl="http://schemas.microsoft.com/office/word/2024/wordml/sdtformatlock" xmlns:w16se="http://schemas.microsoft.com/office/word/2015/wordml/symex" xmlns:wpg="http://schemas.microsoft.com/office/word/2010/wordprocessingGroup" xmlns:wpi="http://schemas.microsoft.com/office/word/2010/wordprocessingInk" xmlns:wne="http://schemas.microsoft.com/office/word/2006/wordml" xmlns:wps="http://schemas.microsoft.com/office/word/2010/wordprocessingShape" mc:Ignorable="w14 w15 w16se w16cid w16 w16cex w16sdtdh w16sdtfl w16du wp14">
+<w:hdr xmlns:wpc="http://schemas.microsoft.com/office/word/2010/wordprocessingCanvas" xmlns:cx="http://schemas.microsoft.com/office/drawing/2014/chartex" xmlns:cx1="http://schemas.microsoft.com/office/drawing/2015/9/8/chartex" xmlns:cx2="http://schemas.microsoft.com/office/drawing/2015/10/21/chartex" xmlns:cx3="http://schemas.microsoft.com/office/drawing/2016/5/9/chartex" xmlns:cx4="http://schemas.microsoft.com/office/drawing/2016/5/10/chartex" xmlns:cx5="http://schemas.microsoft.com/office/drawing/2016/5/11/chartex" xmlns:cx6="http://schemas.microsoft.com/office/drawing/2016/5/12/chartex" xmlns:cx7="http://schemas.microsoft.com/office/drawing/2016/5/13/chartex" xmlns:cx8="http://schemas.microsoft.com/office/drawing/2016/5/14/chartex" xmlns:mc="http://schemas.openxmlformats.org/markup-compatibility/2006" xmlns:aink="http://schemas.microsoft.com/office/drawing/2016/ink" xmlns:am3d="http://schemas.microsoft.com/office/drawing/2017/model3d" xmlns:o="urn:schemas-microsoft-com:office:office" xmlns:oel="http://schemas.microsoft.com/office/2019/extlst" xmlns:r="http://schemas.openxmlformats.org/officeDocument/2006/relationships" xmlns:m="http://schemas.openxmlformats.org/officeDocument/2006/math" xmlns:v="urn:schemas-microsoft-com:vml" xmlns:wp14="http://schemas.microsoft.com/office/word/2010/wordprocessingDrawing" xmlns:wp="http://schemas.openxmlformats.org/drawingml/2006/wordprocessingDrawing" xmlns:w10="urn:schemas-microsoft-com:office:word" xmlns:w="http://schemas.openxmlformats.org/wordprocessingml/2006/main" xmlns:w14="http://schemas.microsoft.com/office/word/2010/wordml" xmlns:w15="http://schemas.microsoft.com/office/word/2012/wordml" xmlns:w16cei="http://schemas.microsoft.com/office/word/2026/wordml/cei" xmlns:w16cex="http://schemas.microsoft.com/office/word/2018/wordml/cex" xmlns:w16cid="http://schemas.microsoft.com/office/word/2016/wordml/cid" xmlns:w16="http://schemas.microsoft.com/office/word/2018/wordml" xmlns:w16du="http://schemas.microsoft.com/office/word/2023/wordml/word16du" xmlns:w16sdtdh="http://schemas.microsoft.com/office/word/2020/wordml/sdtdatahash" xmlns:w16sdtfl="http://schemas.microsoft.com/office/word/2024/wordml/sdtformatlock" xmlns:w16se="http://schemas.microsoft.com/office/word/2015/wordml/symex" xmlns:wpg="http://schemas.microsoft.com/office/word/2010/wordprocessingGroup" xmlns:wpi="http://schemas.microsoft.com/office/word/2010/wordprocessingInk" xmlns:wne="http://schemas.microsoft.com/office/word/2006/wordml" xmlns:wps="http://schemas.microsoft.com/office/word/2010/wordprocessingShape" mc:Ignorable="w14 w15 w16se w16cid w16 w16cex w16sdtdh w16sdtfl w16du wp14">
   <w:p>
     <w:pPr>
       <w:pStyle w:val="Header"/>
@@ -2092,7 +2218,7 @@
 </file>
 
 <file path=word/numbering.xml><?xml version="1.0" encoding="utf-8"?>
-<w:numbering xmlns:wpc="http://schemas.microsoft.com/office/word/2010/wordprocessingCanvas" xmlns:cx="http://schemas.microsoft.com/office/drawing/2014/chartex" xmlns:cx1="http://schemas.microsoft.com/office/drawing/2015/9/8/chartex" xmlns:cx2="http://schemas.microsoft.com/office/drawing/2015/10/21/chartex" xmlns:cx3="http://schemas.microsoft.com/office/drawing/2016/5/9/chartex" xmlns:cx4="http://schemas.microsoft.com/office/drawing/2016/5/10/chartex" xmlns:cx5="http://schemas.microsoft.com/office/drawing/2016/5/11/chartex" xmlns:cx6="http://schemas.microsoft.com/office/drawing/2016/5/12/chartex" xmlns:cx7="http://schemas.microsoft.com/office/drawing/2016/5/13/chartex" xmlns:cx8="http://schemas.microsoft.com/office/drawing/2016/5/14/chartex" xmlns:mc="http://schemas.openxmlformats.org/markup-compatibility/2006" xmlns:aink="http://schemas.microsoft.com/office/drawing/2016/ink" xmlns:am3d="http://schemas.microsoft.com/office/drawing/2017/model3d" xmlns:o="urn:schemas-microsoft-com:office:office" xmlns:oel="http://schemas.microsoft.com/office/2019/extlst" xmlns:r="http://schemas.openxmlformats.org/officeDocument/2006/relationships" xmlns:m="http://schemas.openxmlformats.org/officeDocument/2006/math" xmlns:v="urn:schemas-microsoft-com:vml" xmlns:wp14="http://schemas.microsoft.com/office/word/2010/wordprocessingDrawing" xmlns:wp="http://schemas.openxmlformats.org/drawingml/2006/wordprocessingDrawing" xmlns:w10="urn:schemas-microsoft-com:office:word" xmlns:w="http://schemas.openxmlformats.org/wordprocessingml/2006/main" xmlns:w14="http://schemas.microsoft.com/office/word/2010/wordml" xmlns:w15="http://schemas.microsoft.com/office/word/2012/wordml" xmlns:w16cex="http://schemas.microsoft.com/office/word/2018/wordml/cex" xmlns:w16cid="http://schemas.microsoft.com/office/word/2016/wordml/cid" xmlns:w16="http://schemas.microsoft.com/office/word/2018/wordml" xmlns:w16du="http://schemas.microsoft.com/office/word/2023/wordml/word16du" xmlns:w16sdtdh="http://schemas.microsoft.com/office/word/2020/wordml/sdtdatahash" xmlns:w16sdtfl="http://schemas.microsoft.com/office/word/2024/wordml/sdtformatlock" xmlns:w16se="http://schemas.microsoft.com/office/word/2015/wordml/symex" xmlns:wpg="http://schemas.microsoft.com/office/word/2010/wordprocessingGroup" xmlns:wpi="http://schemas.microsoft.com/office/word/2010/wordprocessingInk" xmlns:wne="http://schemas.microsoft.com/office/word/2006/wordml" xmlns:wps="http://schemas.microsoft.com/office/word/2010/wordprocessingShape" mc:Ignorable="w14 w15 w16se w16cid w16 w16cex w16sdtdh w16sdtfl w16du wp14">
+<w:numbering xmlns:wpc="http://schemas.microsoft.com/office/word/2010/wordprocessingCanvas" xmlns:cx="http://schemas.microsoft.com/office/drawing/2014/chartex" xmlns:cx1="http://schemas.microsoft.com/office/drawing/2015/9/8/chartex" xmlns:cx2="http://schemas.microsoft.com/office/drawing/2015/10/21/chartex" xmlns:cx3="http://schemas.microsoft.com/office/drawing/2016/5/9/chartex" xmlns:cx4="http://schemas.microsoft.com/office/drawing/2016/5/10/chartex" xmlns:cx5="http://schemas.microsoft.com/office/drawing/2016/5/11/chartex" xmlns:cx6="http://schemas.microsoft.com/office/drawing/2016/5/12/chartex" xmlns:cx7="http://schemas.microsoft.com/office/drawing/2016/5/13/chartex" xmlns:cx8="http://schemas.microsoft.com/office/drawing/2016/5/14/chartex" xmlns:mc="http://schemas.openxmlformats.org/markup-compatibility/2006" xmlns:aink="http://schemas.microsoft.com/office/drawing/2016/ink" xmlns:am3d="http://schemas.microsoft.com/office/drawing/2017/model3d" xmlns:o="urn:schemas-microsoft-com:office:office" xmlns:oel="http://schemas.microsoft.com/office/2019/extlst" xmlns:r="http://schemas.openxmlformats.org/officeDocument/2006/relationships" xmlns:m="http://schemas.openxmlformats.org/officeDocument/2006/math" xmlns:v="urn:schemas-microsoft-com:vml" xmlns:wp14="http://schemas.microsoft.com/office/word/2010/wordprocessingDrawing" xmlns:wp="http://schemas.openxmlformats.org/drawingml/2006/wordprocessingDrawing" xmlns:w10="urn:schemas-microsoft-com:office:word" xmlns:w="http://schemas.openxmlformats.org/wordprocessingml/2006/main" xmlns:w14="http://schemas.microsoft.com/office/word/2010/wordml" xmlns:w15="http://schemas.microsoft.com/office/word/2012/wordml" xmlns:w16cei="http://schemas.microsoft.com/office/word/2026/wordml/cei" xmlns:w16cex="http://schemas.microsoft.com/office/word/2018/wordml/cex" xmlns:w16cid="http://schemas.microsoft.com/office/word/2016/wordml/cid" xmlns:w16="http://schemas.microsoft.com/office/word/2018/wordml" xmlns:w16du="http://schemas.microsoft.com/office/word/2023/wordml/word16du" xmlns:w16sdtdh="http://schemas.microsoft.com/office/word/2020/wordml/sdtdatahash" xmlns:w16sdtfl="http://schemas.microsoft.com/office/word/2024/wordml/sdtformatlock" xmlns:w16se="http://schemas.microsoft.com/office/word/2015/wordml/symex" xmlns:wpg="http://schemas.microsoft.com/office/word/2010/wordprocessingGroup" xmlns:wpi="http://schemas.microsoft.com/office/word/2010/wordprocessingInk" xmlns:wne="http://schemas.microsoft.com/office/word/2006/wordml" xmlns:wps="http://schemas.microsoft.com/office/word/2010/wordprocessingShape" mc:Ignorable="w14 w15 w16se w16cid w16 w16cex w16sdtdh w16sdtfl w16du wp14">
   <w:abstractNum w:abstractNumId="0" w15:restartNumberingAfterBreak="0">
     <w:nsid w:val="27F0573B"/>
     <w:multiLevelType w:val="singleLevel"/>

</xml_diff>